<commit_message>
The narrator spells a callsign phonetically, and the seat's name box has room
A callsign with no name file on the shelf is said letter by letter -
Kilo Charlie nine Sierra Papa - from twenty-six phonetic snippets added
to the script, which is how the operator says it too. A name with a
file is the file; a plain name without one stays silent as before.

And in the narrow golf column the seat's name box had been squeezed to
nothing beside the class and the button: it takes its own line now.

Co-Authored-By: Claude Opus 5 (1M context) <noreply@anthropic.com>
</commit_message>
<xml_diff>
--- a/docs/narration/voice-script-missing.docx
+++ b/docs/narration/voice-script-missing.docx
@@ -41,21 +41,6 @@
     </w:p>
     <w:p>
       <w:r>
-        <w:t xml:space="preserve">Par</w:t>
-      </w:r>
-    </w:p>
-    <w:p>
-      <w:r>
-        <w:t xml:space="preserve">Yards</w:t>
-      </w:r>
-    </w:p>
-    <w:p>
-      <w:r>
-        <w:t xml:space="preserve">Feet</w:t>
-      </w:r>
-    </w:p>
-    <w:p>
-      <w:r>
         <w:t xml:space="preserve">To go</w:t>
       </w:r>
     </w:p>
@@ -372,6 +357,136 @@
     <w:p>
       <w:r>
         <w:t xml:space="preserve">Airmailed it.</w:t>
+      </w:r>
+    </w:p>
+    <w:p>
+      <w:r>
+        <w:t xml:space="preserve">Alpha</w:t>
+      </w:r>
+    </w:p>
+    <w:p>
+      <w:r>
+        <w:t xml:space="preserve">Bravo</w:t>
+      </w:r>
+    </w:p>
+    <w:p>
+      <w:r>
+        <w:t xml:space="preserve">Charlie</w:t>
+      </w:r>
+    </w:p>
+    <w:p>
+      <w:r>
+        <w:t xml:space="preserve">Delta</w:t>
+      </w:r>
+    </w:p>
+    <w:p>
+      <w:r>
+        <w:t xml:space="preserve">Echo</w:t>
+      </w:r>
+    </w:p>
+    <w:p>
+      <w:r>
+        <w:t xml:space="preserve">Foxtrot</w:t>
+      </w:r>
+    </w:p>
+    <w:p>
+      <w:r>
+        <w:t xml:space="preserve">Golf</w:t>
+      </w:r>
+    </w:p>
+    <w:p>
+      <w:r>
+        <w:t xml:space="preserve">Hotel</w:t>
+      </w:r>
+    </w:p>
+    <w:p>
+      <w:r>
+        <w:t xml:space="preserve">India</w:t>
+      </w:r>
+    </w:p>
+    <w:p>
+      <w:r>
+        <w:t xml:space="preserve">Juliett</w:t>
+      </w:r>
+    </w:p>
+    <w:p>
+      <w:r>
+        <w:t xml:space="preserve">Kilo</w:t>
+      </w:r>
+    </w:p>
+    <w:p>
+      <w:r>
+        <w:t xml:space="preserve">Lima</w:t>
+      </w:r>
+    </w:p>
+    <w:p>
+      <w:r>
+        <w:t xml:space="preserve">Mike</w:t>
+      </w:r>
+    </w:p>
+    <w:p>
+      <w:r>
+        <w:t xml:space="preserve">November</w:t>
+      </w:r>
+    </w:p>
+    <w:p>
+      <w:r>
+        <w:t xml:space="preserve">Oscar</w:t>
+      </w:r>
+    </w:p>
+    <w:p>
+      <w:r>
+        <w:t xml:space="preserve">Papa</w:t>
+      </w:r>
+    </w:p>
+    <w:p>
+      <w:r>
+        <w:t xml:space="preserve">Quebec</w:t>
+      </w:r>
+    </w:p>
+    <w:p>
+      <w:r>
+        <w:t xml:space="preserve">Romeo</w:t>
+      </w:r>
+    </w:p>
+    <w:p>
+      <w:r>
+        <w:t xml:space="preserve">Sierra</w:t>
+      </w:r>
+    </w:p>
+    <w:p>
+      <w:r>
+        <w:t xml:space="preserve">Tango</w:t>
+      </w:r>
+    </w:p>
+    <w:p>
+      <w:r>
+        <w:t xml:space="preserve">Uniform</w:t>
+      </w:r>
+    </w:p>
+    <w:p>
+      <w:r>
+        <w:t xml:space="preserve">Victor</w:t>
+      </w:r>
+    </w:p>
+    <w:p>
+      <w:r>
+        <w:t xml:space="preserve">Whiskey</w:t>
+      </w:r>
+    </w:p>
+    <w:p>
+      <w:r>
+        <w:t xml:space="preserve">X-ray</w:t>
+      </w:r>
+    </w:p>
+    <w:p>
+      <w:r>
+        <w:t xml:space="preserve">Yankee</w:t>
+      </w:r>
+    </w:p>
+    <w:p>
+      <w:r>
+        <w:t xml:space="preserve">Zulu</w:t>
       </w:r>
     </w:p>
     <w:p>

</xml_diff>

<commit_message>
The narrator says the pieces when a phrase is not recorded
Five single words KC9SP recorded - hole, is, rough, bunker, green - are
the pieces a phrase falls back to: "hole, one, is, par, four" when "the
first" is not on the shelf, "rough", "bunker", "green" for "into the
rough", "into the sand", "on the green". Terse, the way an ATIS is, and
better than silence; the phrase wins whenever it is recorded.

Co-Authored-By: Claude Opus 5 (1M context) <noreply@anthropic.com>
</commit_message>
<xml_diff>
--- a/docs/narration/voice-script-missing.docx
+++ b/docs/narration/voice-script-missing.docx
@@ -361,136 +361,6 @@
     </w:p>
     <w:p>
       <w:r>
-        <w:t xml:space="preserve">Alpha</w:t>
-      </w:r>
-    </w:p>
-    <w:p>
-      <w:r>
-        <w:t xml:space="preserve">Bravo</w:t>
-      </w:r>
-    </w:p>
-    <w:p>
-      <w:r>
-        <w:t xml:space="preserve">Charlie</w:t>
-      </w:r>
-    </w:p>
-    <w:p>
-      <w:r>
-        <w:t xml:space="preserve">Delta</w:t>
-      </w:r>
-    </w:p>
-    <w:p>
-      <w:r>
-        <w:t xml:space="preserve">Echo</w:t>
-      </w:r>
-    </w:p>
-    <w:p>
-      <w:r>
-        <w:t xml:space="preserve">Foxtrot</w:t>
-      </w:r>
-    </w:p>
-    <w:p>
-      <w:r>
-        <w:t xml:space="preserve">Golf</w:t>
-      </w:r>
-    </w:p>
-    <w:p>
-      <w:r>
-        <w:t xml:space="preserve">Hotel</w:t>
-      </w:r>
-    </w:p>
-    <w:p>
-      <w:r>
-        <w:t xml:space="preserve">India</w:t>
-      </w:r>
-    </w:p>
-    <w:p>
-      <w:r>
-        <w:t xml:space="preserve">Juliett</w:t>
-      </w:r>
-    </w:p>
-    <w:p>
-      <w:r>
-        <w:t xml:space="preserve">Kilo</w:t>
-      </w:r>
-    </w:p>
-    <w:p>
-      <w:r>
-        <w:t xml:space="preserve">Lima</w:t>
-      </w:r>
-    </w:p>
-    <w:p>
-      <w:r>
-        <w:t xml:space="preserve">Mike</w:t>
-      </w:r>
-    </w:p>
-    <w:p>
-      <w:r>
-        <w:t xml:space="preserve">November</w:t>
-      </w:r>
-    </w:p>
-    <w:p>
-      <w:r>
-        <w:t xml:space="preserve">Oscar</w:t>
-      </w:r>
-    </w:p>
-    <w:p>
-      <w:r>
-        <w:t xml:space="preserve">Papa</w:t>
-      </w:r>
-    </w:p>
-    <w:p>
-      <w:r>
-        <w:t xml:space="preserve">Quebec</w:t>
-      </w:r>
-    </w:p>
-    <w:p>
-      <w:r>
-        <w:t xml:space="preserve">Romeo</w:t>
-      </w:r>
-    </w:p>
-    <w:p>
-      <w:r>
-        <w:t xml:space="preserve">Sierra</w:t>
-      </w:r>
-    </w:p>
-    <w:p>
-      <w:r>
-        <w:t xml:space="preserve">Tango</w:t>
-      </w:r>
-    </w:p>
-    <w:p>
-      <w:r>
-        <w:t xml:space="preserve">Uniform</w:t>
-      </w:r>
-    </w:p>
-    <w:p>
-      <w:r>
-        <w:t xml:space="preserve">Victor</w:t>
-      </w:r>
-    </w:p>
-    <w:p>
-      <w:r>
-        <w:t xml:space="preserve">Whiskey</w:t>
-      </w:r>
-    </w:p>
-    <w:p>
-      <w:r>
-        <w:t xml:space="preserve">X-ray</w:t>
-      </w:r>
-    </w:p>
-    <w:p>
-      <w:r>
-        <w:t xml:space="preserve">Yankee</w:t>
-      </w:r>
-    </w:p>
-    <w:p>
-      <w:r>
-        <w:t xml:space="preserve">Zulu</w:t>
-      </w:r>
-    </w:p>
-    <w:p>
-      <w:r>
         <w:t xml:space="preserve">The second</w:t>
       </w:r>
     </w:p>

</xml_diff>

<commit_message>
The golfer's own calls, in his voice: "Nice shot!", "That's swimming."
Six calls KC9SP recorded in his own words join the rules' lists - Nice
shot! and On the fairway for a fair ball, In the rough, Found the
bunker, That's swimming and Are you going after that? for the water -
so what the narrator says is what the screen shows. And "the first" is
recorded. One old call's text differed between the rules and the voice
by a dash, so it never had a file; it does now.

Co-Authored-By: Claude Opus 5 (1M context) <noreply@anthropic.com>
</commit_message>
<xml_diff>
--- a/docs/narration/voice-script-missing.docx
+++ b/docs/narration/voice-script-missing.docx
@@ -36,11 +36,6 @@
     </w:p>
     <w:p>
       <w:r>
-        <w:t xml:space="preserve">The first</w:t>
-      </w:r>
-    </w:p>
-    <w:p>
-      <w:r>
         <w:t xml:space="preserve">To go</w:t>
       </w:r>
     </w:p>
@@ -311,7 +306,7 @@
     </w:p>
     <w:p>
       <w:r>
-        <w:t xml:space="preserve">That's a splash. What was the wind?</w:t>
+        <w:t xml:space="preserve">That's a splash - what was the wind?</w:t>
       </w:r>
     </w:p>
     <w:p>

</xml_diff>

<commit_message>
The narrator calls the slot on the sheet: "Player 2 is away"
Rather than a file per name, the golfer is called by their place in
the group, as a starter does - "Player 1 has honors" first off the tee,
"Player 3 is away" after - when those lines are recorded, with the
name and "addresses the ball" as before when they are not. Four more of
KC9SP's calls join the rules: "OOOPS! That's going to need patching",
"Are you new at this?", "We all have bad days", "It's in the cup!". The
adopt tool matches a line the reader cut short by its prefix.

And the isolation guard no longer blames a scratch folder's own "data"
for the operator's: shutil.rmtree on Linux removes by a directory
descriptor, and a relative name against one is not relative to the
working directory. That was the red build since the reset commit.

Co-Authored-By: Claude Opus 5 (1M context) <noreply@anthropic.com>
</commit_message>
<xml_diff>
--- a/docs/narration/voice-script-missing.docx
+++ b/docs/narration/voice-script-missing.docx
@@ -356,6 +356,21 @@
     </w:p>
     <w:p>
       <w:r>
+        <w:t xml:space="preserve">Player 2 has honors</w:t>
+      </w:r>
+    </w:p>
+    <w:p>
+      <w:r>
+        <w:t xml:space="preserve">Player 3 has honors</w:t>
+      </w:r>
+    </w:p>
+    <w:p>
+      <w:r>
+        <w:t xml:space="preserve">Player 4 has honors</w:t>
+      </w:r>
+    </w:p>
+    <w:p>
+      <w:r>
         <w:t xml:space="preserve">The second</w:t>
       </w:r>
     </w:p>

</xml_diff>

<commit_message>
The narrator reads a hole whole when it is recorded that way
hole-<course>-<n>.mp3 - "Hole one is a par four at three hundred and
seventy-seven yards" in one breath - is said at the tee instead of the
pieces, then the wind. KC9SP's first is the first. The adopt tool names
such a file from its opening words, and the player allows a hole the
time it takes. Three more pieces recorded: to go, from the rough, from
the fairway.

Co-Authored-By: Claude Opus 5 (1M context) <noreply@anthropic.com>
</commit_message>
<xml_diff>
--- a/docs/narration/voice-script-missing.docx
+++ b/docs/narration/voice-script-missing.docx
@@ -36,11 +36,6 @@
     </w:p>
     <w:p>
       <w:r>
-        <w:t xml:space="preserve">To go</w:t>
-      </w:r>
-    </w:p>
-    <w:p>
-      <w:r>
         <w:t xml:space="preserve">Pebble Beach</w:t>
       </w:r>
     </w:p>
@@ -107,16 +102,6 @@
     <w:p>
       <w:r>
         <w:t xml:space="preserve">From the tee</w:t>
-      </w:r>
-    </w:p>
-    <w:p>
-      <w:r>
-        <w:t xml:space="preserve">From the fairway</w:t>
-      </w:r>
-    </w:p>
-    <w:p>
-      <w:r>
-        <w:t xml:space="preserve">From the rough</w:t>
       </w:r>
     </w:p>
     <w:p>

</xml_diff>